<commit_message>
docs: apply reviewer fixes to Nidaa FAQ docx
- add architecture flow diagram (Device->Local->Sync->Host->Verify->Audit)
- add 'Why Nidaa?' comparison table (WhatsApp/Telegram/Nidaa, honest incl. E2E not-yet)
- strengthen pilot ask: 4-8wk, 30-100 participants, >=1 designated verifier
- remove internal 'code is source of truth' closing note
- regenerate pilot/Nidaa-Overview-FAQ.docx + Desktop copy
</commit_message>
<xml_diff>
--- a/pilot/Nidaa-Overview-FAQ.docx
+++ b/pilot/Nidaa-Overview-FAQ.docx
@@ -123,7 +123,7 @@
         <w:t xml:space="preserve">What we ask of a pilot partner: </w:t>
       </w:r>
       <w:r>
-        <w:t xml:space="preserve"> not a partnership. A 15-minute conversation about whether Nidaa fits your coordination as a low-burden, 4–8 week pilot — you define verifier roles and own the audit.</w:t>
+        <w:t xml:space="preserve"> not a partnership. We are seeking one organization willing to evaluate Nidaa over a 4–8 week period with approximately 30–100 participants and at least one designated verifier who owns the audit. Low burden, under one hour of training.</w:t>
       </w:r>
     </w:p>
     <w:p>
@@ -263,6 +263,265 @@
       </w:r>
     </w:p>
     <w:p>
+      <w:pPr>
+        <w:pStyle w:val="Heading2"/>
+      </w:pPr>
+      <w:r>
+        <w:rPr>
+          <w:rFonts w:ascii="Calibri" w:hAnsi="Calibri"/>
+          <w:color w:val="111827"/>
+        </w:rPr>
+        <w:t>How information flows (architecture)</w:t>
+      </w:r>
+    </w:p>
+    <w:p>
+      <w:pPr>
+        <w:spacing w:after="120"/>
+      </w:pPr>
+      <w:r>
+        <w:rPr>
+          <w:b w:val="0"/>
+          <w:i/>
+          <w:color w:val="6B7280"/>
+          <w:sz w:val="20"/>
+        </w:rPr>
+        <w:t>One line of flow. The device is the source of truth; verification and audit sit at the host.</w:t>
+      </w:r>
+    </w:p>
+    <w:tbl>
+      <w:tblPr>
+        <w:tblStyle w:val="TableGrid"/>
+        <w:tblW w:type="auto" w:w="0"/>
+        <w:jc w:val="center"/>
+        <w:tblLook w:firstColumn="1" w:firstRow="1" w:lastColumn="0" w:lastRow="0" w:noHBand="0" w:noVBand="1" w:val="04A0"/>
+      </w:tblPr>
+      <w:tblGrid>
+        <w:gridCol w:w="1440"/>
+        <w:gridCol w:w="1440"/>
+        <w:gridCol w:w="1440"/>
+        <w:gridCol w:w="1440"/>
+        <w:gridCol w:w="1440"/>
+        <w:gridCol w:w="1440"/>
+      </w:tblGrid>
+      <w:tr>
+        <w:tc>
+          <w:tcPr>
+            <w:tcW w:type="dxa" w:w="1440"/>
+          </w:tcPr>
+          <w:p>
+            <w:pPr>
+              <w:jc w:val="center"/>
+            </w:pPr>
+            <w:r/>
+            <w:r>
+              <w:rPr>
+                <w:b/>
+                <w:sz w:val="18"/>
+              </w:rPr>
+              <w:t>Device</w:t>
+            </w:r>
+            <w:r>
+              <w:rPr>
+                <w:b/>
+                <w:sz w:val="18"/>
+              </w:rPr>
+              <w:br/>
+              <w:t>(browser/PWA)</w:t>
+            </w:r>
+          </w:p>
+        </w:tc>
+        <w:tc>
+          <w:tcPr>
+            <w:tcW w:type="dxa" w:w="1440"/>
+          </w:tcPr>
+          <w:p>
+            <w:pPr>
+              <w:jc w:val="center"/>
+            </w:pPr>
+            <w:r/>
+            <w:r>
+              <w:rPr>
+                <w:b w:val="0"/>
+                <w:sz w:val="18"/>
+              </w:rPr>
+              <w:t>Local Storage</w:t>
+            </w:r>
+            <w:r>
+              <w:rPr>
+                <w:b w:val="0"/>
+                <w:sz w:val="18"/>
+              </w:rPr>
+              <w:br/>
+              <w:t>(IndexedDB,</w:t>
+            </w:r>
+            <w:r>
+              <w:rPr>
+                <w:b w:val="0"/>
+                <w:sz w:val="18"/>
+              </w:rPr>
+              <w:br/>
+              <w:t>offline)</w:t>
+            </w:r>
+          </w:p>
+        </w:tc>
+        <w:tc>
+          <w:tcPr>
+            <w:tcW w:type="dxa" w:w="1440"/>
+          </w:tcPr>
+          <w:p>
+            <w:pPr>
+              <w:jc w:val="center"/>
+            </w:pPr>
+            <w:r/>
+            <w:r>
+              <w:rPr>
+                <w:b w:val="0"/>
+                <w:sz w:val="18"/>
+              </w:rPr>
+              <w:t>Sync</w:t>
+            </w:r>
+            <w:r>
+              <w:rPr>
+                <w:b w:val="0"/>
+                <w:sz w:val="18"/>
+              </w:rPr>
+              <w:br/>
+              <w:t>(when online)</w:t>
+            </w:r>
+          </w:p>
+        </w:tc>
+        <w:tc>
+          <w:tcPr>
+            <w:tcW w:type="dxa" w:w="1440"/>
+            <w:shd w:val="clear" w:fill="EAF6F4"/>
+          </w:tcPr>
+          <w:p>
+            <w:pPr>
+              <w:jc w:val="center"/>
+            </w:pPr>
+            <w:r/>
+            <w:r>
+              <w:rPr>
+                <w:b w:val="0"/>
+                <w:sz w:val="18"/>
+              </w:rPr>
+              <w:t>Host Server</w:t>
+            </w:r>
+            <w:r>
+              <w:rPr>
+                <w:b w:val="0"/>
+                <w:sz w:val="18"/>
+              </w:rPr>
+              <w:br/>
+              <w:t>(JSON store)</w:t>
+            </w:r>
+          </w:p>
+        </w:tc>
+        <w:tc>
+          <w:tcPr>
+            <w:tcW w:type="dxa" w:w="1440"/>
+            <w:shd w:val="clear" w:fill="EAF6F4"/>
+          </w:tcPr>
+          <w:p>
+            <w:pPr>
+              <w:jc w:val="center"/>
+            </w:pPr>
+            <w:r/>
+            <w:r>
+              <w:rPr>
+                <w:b/>
+                <w:color w:val="0F766E"/>
+                <w:sz w:val="18"/>
+              </w:rPr>
+              <w:t>Verification</w:t>
+            </w:r>
+            <w:r>
+              <w:rPr>
+                <w:b/>
+                <w:color w:val="0F766E"/>
+                <w:sz w:val="18"/>
+              </w:rPr>
+              <w:br/>
+              <w:t>(verifier token,</w:t>
+            </w:r>
+            <w:r>
+              <w:rPr>
+                <w:b/>
+                <w:color w:val="0F766E"/>
+                <w:sz w:val="18"/>
+              </w:rPr>
+              <w:br/>
+              <w:t>role-gated)</w:t>
+            </w:r>
+          </w:p>
+        </w:tc>
+        <w:tc>
+          <w:tcPr>
+            <w:tcW w:type="dxa" w:w="1440"/>
+            <w:shd w:val="clear" w:fill="EAF6F4"/>
+          </w:tcPr>
+          <w:p>
+            <w:pPr>
+              <w:jc w:val="center"/>
+            </w:pPr>
+            <w:r/>
+            <w:r>
+              <w:rPr>
+                <w:b/>
+                <w:color w:val="0F766E"/>
+                <w:sz w:val="18"/>
+              </w:rPr>
+              <w:t>Audit Log</w:t>
+            </w:r>
+            <w:r>
+              <w:rPr>
+                <w:b/>
+                <w:color w:val="0F766E"/>
+                <w:sz w:val="18"/>
+              </w:rPr>
+              <w:br/>
+              <w:t>(recorded,</w:t>
+            </w:r>
+            <w:r>
+              <w:rPr>
+                <w:b/>
+                <w:color w:val="0F766E"/>
+                <w:sz w:val="18"/>
+              </w:rPr>
+              <w:br/>
+              <w:t>reversible)</w:t>
+            </w:r>
+          </w:p>
+        </w:tc>
+      </w:tr>
+    </w:tbl>
+    <w:p>
+      <w:pPr>
+        <w:jc w:val="center"/>
+      </w:pPr>
+      <w:r>
+        <w:rPr>
+          <w:color w:val="6B7280"/>
+          <w:sz w:val="24"/>
+        </w:rPr>
+        <w:t xml:space="preserve">      →      →      →      →      →      </w:t>
+      </w:r>
+    </w:p>
+    <w:p>
+      <w:pPr>
+        <w:spacing w:after="120"/>
+      </w:pPr>
+      <w:r>
+        <w:rPr>
+          <w:b w:val="0"/>
+          <w:i w:val="0"/>
+          <w:color w:val="111827"/>
+          <w:sz w:val="20"/>
+        </w:rPr>
+        <w:t>Offline posting and browsing work at the Device + Local Storage stage with no connection. Sync, Verification, and Audit require a connection to the Host. Mesh sync (device-to-device, no host) is planned but not built.</w:t>
+      </w:r>
+    </w:p>
+    <w:p>
       <w:r>
         <w:br w:type="page"/>
       </w:r>
@@ -277,6 +536,489 @@
           <w:color w:val="0F766E"/>
         </w:rPr>
         <w:t>Project Overview</w:t>
+      </w:r>
+    </w:p>
+    <w:p>
+      <w:pPr>
+        <w:pStyle w:val="Heading2"/>
+      </w:pPr>
+      <w:r>
+        <w:rPr>
+          <w:rFonts w:ascii="Calibri" w:hAnsi="Calibri"/>
+          <w:color w:val="111827"/>
+        </w:rPr>
+        <w:t>Why Nidaa? — comparison</w:t>
+      </w:r>
+    </w:p>
+    <w:p>
+      <w:pPr>
+        <w:spacing w:after="120"/>
+      </w:pPr>
+      <w:r>
+        <w:rPr>
+          <w:b w:val="0"/>
+          <w:i w:val="0"/>
+          <w:color w:val="6B7280"/>
+          <w:sz w:val="20"/>
+        </w:rPr>
+        <w:t>Nidaa is not a messaging app. The differences that matter for coordination:</w:t>
+      </w:r>
+    </w:p>
+    <w:tbl>
+      <w:tblPr>
+        <w:tblStyle w:val="TableGrid"/>
+        <w:tblW w:type="auto" w:w="0"/>
+        <w:tblLook w:firstColumn="1" w:firstRow="1" w:lastColumn="0" w:lastRow="0" w:noHBand="0" w:noVBand="1" w:val="04A0"/>
+      </w:tblPr>
+      <w:tblGrid>
+        <w:gridCol w:w="2160"/>
+        <w:gridCol w:w="2160"/>
+        <w:gridCol w:w="2160"/>
+        <w:gridCol w:w="2160"/>
+      </w:tblGrid>
+      <w:tr>
+        <w:tc>
+          <w:tcPr>
+            <w:tcW w:type="dxa" w:w="2160"/>
+            <w:shd w:val="clear" w:fill="0F766E"/>
+          </w:tcPr>
+          <w:p>
+            <w:r/>
+            <w:r>
+              <w:rPr>
+                <w:b/>
+                <w:color w:val="FFFFFF"/>
+                <w:sz w:val="19"/>
+              </w:rPr>
+              <w:t>Capability</w:t>
+            </w:r>
+          </w:p>
+        </w:tc>
+        <w:tc>
+          <w:tcPr>
+            <w:tcW w:type="dxa" w:w="2160"/>
+            <w:shd w:val="clear" w:fill="0F766E"/>
+          </w:tcPr>
+          <w:p>
+            <w:r/>
+            <w:r>
+              <w:rPr>
+                <w:b/>
+                <w:color w:val="FFFFFF"/>
+                <w:sz w:val="19"/>
+              </w:rPr>
+              <w:t>WhatsApp</w:t>
+            </w:r>
+          </w:p>
+        </w:tc>
+        <w:tc>
+          <w:tcPr>
+            <w:tcW w:type="dxa" w:w="2160"/>
+            <w:shd w:val="clear" w:fill="0F766E"/>
+          </w:tcPr>
+          <w:p>
+            <w:r/>
+            <w:r>
+              <w:rPr>
+                <w:b/>
+                <w:color w:val="FFFFFF"/>
+                <w:sz w:val="19"/>
+              </w:rPr>
+              <w:t>Telegram</w:t>
+            </w:r>
+          </w:p>
+        </w:tc>
+        <w:tc>
+          <w:tcPr>
+            <w:tcW w:type="dxa" w:w="2160"/>
+            <w:shd w:val="clear" w:fill="0F766E"/>
+          </w:tcPr>
+          <w:p>
+            <w:r/>
+            <w:r>
+              <w:rPr>
+                <w:b/>
+                <w:color w:val="FFFFFF"/>
+                <w:sz w:val="19"/>
+              </w:rPr>
+              <w:t>Nidaa</w:t>
+            </w:r>
+          </w:p>
+        </w:tc>
+      </w:tr>
+      <w:tr>
+        <w:tc>
+          <w:tcPr>
+            <w:tcW w:type="dxa" w:w="2160"/>
+          </w:tcPr>
+          <w:p>
+            <w:r/>
+            <w:r>
+              <w:rPr>
+                <w:sz w:val="19"/>
+              </w:rPr>
+              <w:t>Offline posting / browsing</w:t>
+            </w:r>
+          </w:p>
+        </w:tc>
+        <w:tc>
+          <w:tcPr>
+            <w:tcW w:type="dxa" w:w="2160"/>
+          </w:tcPr>
+          <w:p>
+            <w:r/>
+            <w:r>
+              <w:rPr>
+                <w:sz w:val="19"/>
+              </w:rPr>
+              <w:t>Partial</w:t>
+            </w:r>
+          </w:p>
+        </w:tc>
+        <w:tc>
+          <w:tcPr>
+            <w:tcW w:type="dxa" w:w="2160"/>
+          </w:tcPr>
+          <w:p>
+            <w:r/>
+            <w:r>
+              <w:rPr>
+                <w:sz w:val="19"/>
+              </w:rPr>
+              <w:t>Partial</w:t>
+            </w:r>
+          </w:p>
+        </w:tc>
+        <w:tc>
+          <w:tcPr>
+            <w:tcW w:type="dxa" w:w="2160"/>
+          </w:tcPr>
+          <w:p>
+            <w:r/>
+            <w:r>
+              <w:rPr>
+                <w:b/>
+                <w:color w:val="0F766E"/>
+                <w:sz w:val="19"/>
+              </w:rPr>
+              <w:t>Yes (device-first)</w:t>
+            </w:r>
+          </w:p>
+        </w:tc>
+      </w:tr>
+      <w:tr>
+        <w:tc>
+          <w:tcPr>
+            <w:tcW w:type="dxa" w:w="2160"/>
+          </w:tcPr>
+          <w:p>
+            <w:r/>
+            <w:r>
+              <w:rPr>
+                <w:sz w:val="19"/>
+              </w:rPr>
+              <w:t>Shared browsable board</w:t>
+            </w:r>
+          </w:p>
+        </w:tc>
+        <w:tc>
+          <w:tcPr>
+            <w:tcW w:type="dxa" w:w="2160"/>
+          </w:tcPr>
+          <w:p>
+            <w:r/>
+            <w:r>
+              <w:rPr>
+                <w:sz w:val="19"/>
+              </w:rPr>
+              <w:t>No</w:t>
+            </w:r>
+          </w:p>
+        </w:tc>
+        <w:tc>
+          <w:tcPr>
+            <w:tcW w:type="dxa" w:w="2160"/>
+          </w:tcPr>
+          <w:p>
+            <w:r/>
+            <w:r>
+              <w:rPr>
+                <w:sz w:val="19"/>
+              </w:rPr>
+              <w:t>Limited (channels)</w:t>
+            </w:r>
+          </w:p>
+        </w:tc>
+        <w:tc>
+          <w:tcPr>
+            <w:tcW w:type="dxa" w:w="2160"/>
+          </w:tcPr>
+          <w:p>
+            <w:r/>
+            <w:r>
+              <w:rPr>
+                <w:b/>
+                <w:color w:val="0F766E"/>
+                <w:sz w:val="19"/>
+              </w:rPr>
+              <w:t>Yes</w:t>
+            </w:r>
+          </w:p>
+        </w:tc>
+      </w:tr>
+      <w:tr>
+        <w:tc>
+          <w:tcPr>
+            <w:tcW w:type="dxa" w:w="2160"/>
+          </w:tcPr>
+          <w:p>
+            <w:r/>
+            <w:r>
+              <w:rPr>
+                <w:sz w:val="19"/>
+              </w:rPr>
+              <w:t>Role-gated verification</w:t>
+            </w:r>
+          </w:p>
+        </w:tc>
+        <w:tc>
+          <w:tcPr>
+            <w:tcW w:type="dxa" w:w="2160"/>
+          </w:tcPr>
+          <w:p>
+            <w:r/>
+            <w:r>
+              <w:rPr>
+                <w:sz w:val="19"/>
+              </w:rPr>
+              <w:t>No</w:t>
+            </w:r>
+          </w:p>
+        </w:tc>
+        <w:tc>
+          <w:tcPr>
+            <w:tcW w:type="dxa" w:w="2160"/>
+          </w:tcPr>
+          <w:p>
+            <w:r/>
+            <w:r>
+              <w:rPr>
+                <w:sz w:val="19"/>
+              </w:rPr>
+              <w:t>No</w:t>
+            </w:r>
+          </w:p>
+        </w:tc>
+        <w:tc>
+          <w:tcPr>
+            <w:tcW w:type="dxa" w:w="2160"/>
+          </w:tcPr>
+          <w:p>
+            <w:r/>
+            <w:r>
+              <w:rPr>
+                <w:b/>
+                <w:color w:val="0F766E"/>
+                <w:sz w:val="19"/>
+              </w:rPr>
+              <w:t>Yes (verifier/admin)</w:t>
+            </w:r>
+          </w:p>
+        </w:tc>
+      </w:tr>
+      <w:tr>
+        <w:tc>
+          <w:tcPr>
+            <w:tcW w:type="dxa" w:w="2160"/>
+          </w:tcPr>
+          <w:p>
+            <w:r/>
+            <w:r>
+              <w:rPr>
+                <w:sz w:val="19"/>
+              </w:rPr>
+              <w:t>Audit trail of verification</w:t>
+            </w:r>
+          </w:p>
+        </w:tc>
+        <w:tc>
+          <w:tcPr>
+            <w:tcW w:type="dxa" w:w="2160"/>
+          </w:tcPr>
+          <w:p>
+            <w:r/>
+            <w:r>
+              <w:rPr>
+                <w:sz w:val="19"/>
+              </w:rPr>
+              <w:t>No</w:t>
+            </w:r>
+          </w:p>
+        </w:tc>
+        <w:tc>
+          <w:tcPr>
+            <w:tcW w:type="dxa" w:w="2160"/>
+          </w:tcPr>
+          <w:p>
+            <w:r/>
+            <w:r>
+              <w:rPr>
+                <w:sz w:val="19"/>
+              </w:rPr>
+              <w:t>No</w:t>
+            </w:r>
+          </w:p>
+        </w:tc>
+        <w:tc>
+          <w:tcPr>
+            <w:tcW w:type="dxa" w:w="2160"/>
+          </w:tcPr>
+          <w:p>
+            <w:r/>
+            <w:r>
+              <w:rPr>
+                <w:b/>
+                <w:color w:val="0F766E"/>
+                <w:sz w:val="19"/>
+              </w:rPr>
+              <w:t>Yes (recorded, reversible)</w:t>
+            </w:r>
+          </w:p>
+        </w:tc>
+      </w:tr>
+      <w:tr>
+        <w:tc>
+          <w:tcPr>
+            <w:tcW w:type="dxa" w:w="2160"/>
+          </w:tcPr>
+          <w:p>
+            <w:r/>
+            <w:r>
+              <w:rPr>
+                <w:sz w:val="19"/>
+              </w:rPr>
+              <w:t>End-to-end encryption</w:t>
+            </w:r>
+          </w:p>
+        </w:tc>
+        <w:tc>
+          <w:tcPr>
+            <w:tcW w:type="dxa" w:w="2160"/>
+          </w:tcPr>
+          <w:p>
+            <w:r/>
+            <w:r>
+              <w:rPr>
+                <w:sz w:val="19"/>
+              </w:rPr>
+              <w:t>Yes (default)</w:t>
+            </w:r>
+          </w:p>
+        </w:tc>
+        <w:tc>
+          <w:tcPr>
+            <w:tcW w:type="dxa" w:w="2160"/>
+          </w:tcPr>
+          <w:p>
+            <w:r/>
+            <w:r>
+              <w:rPr>
+                <w:sz w:val="19"/>
+              </w:rPr>
+              <w:t>Optional</w:t>
+            </w:r>
+          </w:p>
+        </w:tc>
+        <w:tc>
+          <w:tcPr>
+            <w:tcW w:type="dxa" w:w="2160"/>
+          </w:tcPr>
+          <w:p>
+            <w:r/>
+            <w:r>
+              <w:rPr>
+                <w:b/>
+                <w:color w:val="0F766E"/>
+                <w:sz w:val="19"/>
+              </w:rPr>
+              <w:t>Not yet (planned)</w:t>
+            </w:r>
+          </w:p>
+        </w:tc>
+      </w:tr>
+      <w:tr>
+        <w:tc>
+          <w:tcPr>
+            <w:tcW w:type="dxa" w:w="2160"/>
+          </w:tcPr>
+          <w:p>
+            <w:r/>
+            <w:r>
+              <w:rPr>
+                <w:sz w:val="19"/>
+              </w:rPr>
+              <w:t>Self-hostable</w:t>
+            </w:r>
+          </w:p>
+        </w:tc>
+        <w:tc>
+          <w:tcPr>
+            <w:tcW w:type="dxa" w:w="2160"/>
+          </w:tcPr>
+          <w:p>
+            <w:r/>
+            <w:r>
+              <w:rPr>
+                <w:sz w:val="19"/>
+              </w:rPr>
+              <w:t>No</w:t>
+            </w:r>
+          </w:p>
+        </w:tc>
+        <w:tc>
+          <w:tcPr>
+            <w:tcW w:type="dxa" w:w="2160"/>
+          </w:tcPr>
+          <w:p>
+            <w:r/>
+            <w:r>
+              <w:rPr>
+                <w:sz w:val="19"/>
+              </w:rPr>
+              <w:t>No</w:t>
+            </w:r>
+          </w:p>
+        </w:tc>
+        <w:tc>
+          <w:tcPr>
+            <w:tcW w:type="dxa" w:w="2160"/>
+          </w:tcPr>
+          <w:p>
+            <w:r/>
+            <w:r>
+              <w:rPr>
+                <w:b/>
+                <w:color w:val="0F766E"/>
+                <w:sz w:val="19"/>
+              </w:rPr>
+              <w:t>Intended (packaging planned)</w:t>
+            </w:r>
+          </w:p>
+        </w:tc>
+      </w:tr>
+    </w:tbl>
+    <w:p>
+      <w:pPr>
+        <w:spacing w:after="120"/>
+      </w:pPr>
+      <w:r>
+        <w:rPr>
+          <w:b w:val="0"/>
+          <w:i/>
+          <w:color w:val="6B7280"/>
+          <w:sz w:val="19"/>
+        </w:rPr>
+        <w:t>Honest note: WhatsApp/Telegram are far more mature and field-tested. Nidaa's only claimed differentiators are offline-first (device is source of truth) and audited, reversible verification. Whether those matter in practice is unvalidated.</w:t>
       </w:r>
     </w:p>
     <w:p>
@@ -923,7 +1665,7 @@
           <w:color w:val="6B7280"/>
           <w:sz w:val="18"/>
         </w:rPr>
-        <w:t>— End of overview. For the complete 80-question FAQ, implementation status, and ethical-risk detail, see NIDAA-FAQ-OVERVIEW.md in the same package. Where this document and the running code disagree, the code is the source of truth.</w:t>
+        <w:t>— End of overview. For the complete 80-question FAQ, implementation status, and ethical-risk detail, see NIDAA-FAQ-OVERVIEW.md in the same package.</w:t>
       </w:r>
     </w:p>
     <w:sectPr>

</xml_diff>

<commit_message>
docs: apply red-team fixes to Nidaa outreach package
Red-team (4 personas) found safety/liability gaps + internal contradictions. Fixed:
- governance relabeled: roles in code, operating model PLANNED/unvalidated (was 'Implemented')
- added 'Deployed controls vs promised' honesty (self-host/E2E/license NOT built)
- verification is online-only: trust dies during shutdown (admitted, not implied)
- targeting hazard elevated to PRIMARY ethical risk; precise coords optional/flagged
- map facility data staleness caveat (HDX/OSM, no date)
- 'not a partnership' -> partner-vs-team responsibilities table
- >=2 independent verifiers (fixes single-verifier vs 'another can undo' contradiction)
- failure/risk ranking now leads with physical harm, not just no-adoption
- narrowed scope honesty: local resilient list, not cross-community (no mesh/federation)
- regenerated docx (3 tables) + Desktop copy; updated 80-Q md to match
</commit_message>
<xml_diff>
--- a/pilot/Nidaa-Overview-FAQ.docx
+++ b/pilot/Nidaa-Overview-FAQ.docx
@@ -31,9 +31,9 @@
           <w:b/>
           <w:i w:val="0"/>
           <w:color w:val="111827"/>
-          <w:sz w:val="22"/>
+          <w:sz w:val="20"/>
         </w:rPr>
-        <w:t>Read this page in under 60 seconds.</w:t>
+        <w:t>Read the summary above first; the rest of the document is for reference. Honesty note: this is an early-stage prototype with no pilot yet — several safety and privacy controls described below are planned, not built.</w:t>
       </w:r>
     </w:p>
     <w:p>
@@ -120,10 +120,25 @@
         <w:rPr>
           <w:b/>
         </w:rPr>
+        <w:t xml:space="preserve">Safety note: </w:t>
+      </w:r>
+      <w:r>
+        <w:t xml:space="preserve"> a board of who-needs-what is a sensitive record. Precise coordinates are optional and flagged as potentially unsafe; any deployment must weigh surveillance/targeting risk against coordination value.</w:t>
+      </w:r>
+    </w:p>
+    <w:p>
+      <w:pPr>
+        <w:pStyle w:val="ListBullet"/>
+        <w:spacing w:after="80"/>
+      </w:pPr>
+      <w:r>
+        <w:rPr>
+          <w:b/>
+        </w:rPr>
         <w:t xml:space="preserve">What we ask of a pilot partner: </w:t>
       </w:r>
       <w:r>
-        <w:t xml:space="preserve"> not a partnership. We are seeking one organization willing to evaluate Nidaa over a 4–8 week period with approximately 30–100 participants and at least one designated verifier who owns the audit. Low burden, under one hour of training.</w:t>
+        <w:t xml:space="preserve"> we are seeking one organization willing to evaluate Nidaa over a 4–8 week period with approximately 30–100 participants and at least two independent verifiers who jointly own the audit. Low burden, under one hour of training. This is problem-validation, not a commitment.</w:t>
       </w:r>
     </w:p>
     <w:p>
@@ -161,7 +176,7 @@
           <w:b/>
           <w:color w:val="15803D"/>
         </w:rPr>
-        <w:t>Implemented:</w:t>
+        <w:t>Implemented (in code, not yet field-tested):</w:t>
       </w:r>
     </w:p>
     <w:p>
@@ -197,7 +212,7 @@
         <w:spacing w:after="40"/>
       </w:pPr>
       <w:r>
-        <w:t>Governance model (verifier / admin roles defined; audit + reversibility)</w:t>
+        <w:t>Governance roles defined in code (verifier / admin); operating model PLANNED / unvalidated</w:t>
       </w:r>
     </w:p>
     <w:p>
@@ -254,12 +269,104 @@
       </w:pPr>
       <w:r>
         <w:rPr>
+          <w:b/>
+          <w:i w:val="0"/>
+          <w:color w:val="B91C1C"/>
+          <w:sz w:val="20"/>
+        </w:rPr>
+        <w:t>Deployed controls vs promised controls (read this before trusting Nidaa with sensitive data):</w:t>
+      </w:r>
+    </w:p>
+    <w:p>
+      <w:pPr>
+        <w:spacing w:after="40"/>
+      </w:pPr>
+      <w:r>
+        <w:rPr>
+          <w:b/>
+          <w:color w:val="6B7280"/>
+        </w:rPr>
+        <w:t>Actually present today:</w:t>
+      </w:r>
+    </w:p>
+    <w:p>
+      <w:pPr>
+        <w:pStyle w:val="ListBullet2"/>
+        <w:spacing w:after="40"/>
+      </w:pPr>
+      <w:r>
+        <w:t>Optional contact fields; no mandatory personal identifiers to post or browse</w:t>
+      </w:r>
+    </w:p>
+    <w:p>
+      <w:pPr>
+        <w:pStyle w:val="ListBullet2"/>
+        <w:spacing w:after="40"/>
+      </w:pPr>
+      <w:r>
+        <w:t>Single-host JSON store; posts readable by the host operator</w:t>
+      </w:r>
+    </w:p>
+    <w:p>
+      <w:pPr>
+        <w:spacing w:after="40"/>
+      </w:pPr>
+      <w:r>
+        <w:rPr>
+          <w:b/>
+          <w:color w:val="B91C1C"/>
+        </w:rPr>
+        <w:t>Promised, NOT built yet:</w:t>
+      </w:r>
+    </w:p>
+    <w:p>
+      <w:pPr>
+        <w:pStyle w:val="ListBullet2"/>
+        <w:spacing w:after="40"/>
+      </w:pPr>
+      <w:r>
+        <w:t>Self-hosting packaging (today you would run on the Nidaa team's host or self-host manually)</w:t>
+      </w:r>
+    </w:p>
+    <w:p>
+      <w:pPr>
+        <w:pStyle w:val="ListBullet2"/>
+        <w:spacing w:after="40"/>
+      </w:pPr>
+      <w:r>
+        <w:t>End-to-end encryption (data is not E2E-encrypted yet)</w:t>
+      </w:r>
+    </w:p>
+    <w:p>
+      <w:pPr>
+        <w:pStyle w:val="ListBullet2"/>
+        <w:spacing w:after="40"/>
+      </w:pPr>
+      <w:r>
+        <w:t>Confirmed open-source license (code is public-in-intent; license to be finalized)</w:t>
+      </w:r>
+    </w:p>
+    <w:p>
+      <w:pPr>
+        <w:pStyle w:val="ListBullet2"/>
+        <w:spacing w:after="40"/>
+      </w:pPr>
+      <w:r>
+        <w:t>External security / ethics review (none yet)</w:t>
+      </w:r>
+    </w:p>
+    <w:p>
+      <w:pPr>
+        <w:spacing w:after="120"/>
+      </w:pPr>
+      <w:r>
+        <w:rPr>
           <w:b w:val="0"/>
           <w:i/>
           <w:color w:val="6B7280"/>
           <w:sz w:val="20"/>
         </w:rPr>
-        <w:t>Everything about real-world usefulness is an assumption awaiting validation through pilot deployment. This document distinguishes implemented features from intended ones throughout.</w:t>
+        <w:t>Do not treat Nidaa as private or self-controlled until the promised controls ship. A pilot should not proceed without a do-no-harm review, a basic data-protection assessment, and a data-processing agreement stating ownership and deletion. (A do-no-harm summary already exists; the DPIA and agreement are still to be completed.)</w:t>
       </w:r>
     </w:p>
     <w:p>
@@ -518,7 +625,7 @@
           <w:color w:val="111827"/>
           <w:sz w:val="20"/>
         </w:rPr>
-        <w:t>Offline posting and browsing work at the Device + Local Storage stage with no connection. Sync, Verification, and Audit require a connection to the Host. Mesh sync (device-to-device, no host) is planned but not built.</w:t>
+        <w:t>Offline posting and browsing work at the Device + Local Storage stage with no connection. Sync, Verification, and Audit require a connection to the Host — so during a network shutdown the 'verified' state cannot be updated. Nidaa preserves unverified local posts; it does NOT solve trust under a total blackout. Mesh sync (device-to-device, no host) is planned, not built.</w:t>
       </w:r>
     </w:p>
     <w:p>
@@ -657,7 +764,7 @@
               <w:rPr>
                 <w:sz w:val="19"/>
               </w:rPr>
-              <w:t>Offline posting / browsing</w:t>
+              <w:t>Post offline (no connection)</w:t>
             </w:r>
           </w:p>
         </w:tc>
@@ -671,7 +778,7 @@
               <w:rPr>
                 <w:sz w:val="19"/>
               </w:rPr>
-              <w:t>Partial</w:t>
+              <w:t>No</w:t>
             </w:r>
           </w:p>
         </w:tc>
@@ -685,7 +792,7 @@
               <w:rPr>
                 <w:sz w:val="19"/>
               </w:rPr>
-              <w:t>Partial</w:t>
+              <w:t>No</w:t>
             </w:r>
           </w:p>
         </w:tc>
@@ -702,6 +809,66 @@
                 <w:sz w:val="19"/>
               </w:rPr>
               <w:t>Yes (device-first)</w:t>
+            </w:r>
+          </w:p>
+        </w:tc>
+      </w:tr>
+      <w:tr>
+        <w:tc>
+          <w:tcPr>
+            <w:tcW w:type="dxa" w:w="2160"/>
+          </w:tcPr>
+          <w:p>
+            <w:r/>
+            <w:r>
+              <w:rPr>
+                <w:sz w:val="19"/>
+              </w:rPr>
+              <w:t>Browse history offline</w:t>
+            </w:r>
+          </w:p>
+        </w:tc>
+        <w:tc>
+          <w:tcPr>
+            <w:tcW w:type="dxa" w:w="2160"/>
+          </w:tcPr>
+          <w:p>
+            <w:r/>
+            <w:r>
+              <w:rPr>
+                <w:sz w:val="19"/>
+              </w:rPr>
+              <w:t>Yes (local)</w:t>
+            </w:r>
+          </w:p>
+        </w:tc>
+        <w:tc>
+          <w:tcPr>
+            <w:tcW w:type="dxa" w:w="2160"/>
+          </w:tcPr>
+          <w:p>
+            <w:r/>
+            <w:r>
+              <w:rPr>
+                <w:sz w:val="19"/>
+              </w:rPr>
+              <w:t>Yes (local)</w:t>
+            </w:r>
+          </w:p>
+        </w:tc>
+        <w:tc>
+          <w:tcPr>
+            <w:tcW w:type="dxa" w:w="2160"/>
+          </w:tcPr>
+          <w:p>
+            <w:r/>
+            <w:r>
+              <w:rPr>
+                <w:b/>
+                <w:color w:val="0F766E"/>
+                <w:sz w:val="19"/>
+              </w:rPr>
+              <w:t>Yes</w:t>
             </w:r>
           </w:p>
         </w:tc>
@@ -1018,7 +1185,7 @@
           <w:color w:val="6B7280"/>
           <w:sz w:val="19"/>
         </w:rPr>
-        <w:t>Honest note: WhatsApp/Telegram are far more mature and field-tested. Nidaa's only claimed differentiators are offline-first (device is source of truth) and audited, reversible verification. Whether those matter in practice is unvalidated.</w:t>
+        <w:t>Honest note: WhatsApp/Telegram are far more mature and field-tested. Nidaa's only claimed differentiators are offline-first posting (device is source of truth) and audited, reversible verification. Whether those matter in practice is unvalidated. Nidaa today is a resilient LOCAL list per community; cross-community coordination depends on mesh/federation, which is planned, not built.</w:t>
       </w:r>
     </w:p>
     <w:p>
@@ -1043,7 +1210,7 @@
           <w:i w:val="0"/>
           <w:sz w:val="22"/>
         </w:rPr>
-        <w:t>In crises, the channels people rely on — messaging groups, central servers, social platforms — become unreliable at the moment needs spike. Information scatters across closed chats newcomers cannot see, is lost when phones die or accounts are banned, and cannot be trusted because anyone can post anything. Nidaa targets the information-coordination layer only: it does not solve logistics, physical delivery, funding, or personal security.</w:t>
+        <w:t>In crises, the channels people rely on — messaging groups, central servers, social platforms — become unreliable at the moment needs spike. Information scatters across closed chats newcomers cannot see, is lost when phones die or accounts are banned, and cannot be trusted because anyone can post anything. Nidaa targets the information-coordination layer only: it does not solve logistics, physical delivery, funding, or personal security. Important: if a community's real bottleneck is physical supply (resources, not information), Nidaa does not address it.</w:t>
       </w:r>
     </w:p>
     <w:p>
@@ -1109,7 +1276,7 @@
         <w:spacing w:after="80"/>
       </w:pPr>
       <w:r>
-        <w:t>The map seeds facility locations from humanitarian datasets (HDX / OpenStreetMap).</w:t>
+        <w:t>The map seeds facility locations from humanitarian datasets (HDX / OpenStreetMap) — see the staleness caveat below.</w:t>
       </w:r>
     </w:p>
     <w:p>
@@ -1139,6 +1306,20 @@
     </w:p>
     <w:p>
       <w:pPr>
+        <w:spacing w:after="120"/>
+      </w:pPr>
+      <w:r>
+        <w:rPr>
+          <w:b w:val="0"/>
+          <w:i w:val="0"/>
+          <w:color w:val="111827"/>
+          <w:sz w:val="20"/>
+        </w:rPr>
+        <w:t>Limitation: verification requires a connection to the Host. During a network shutdown the 'verified' state cannot be updated, so trust signals are stale precisely when crisis peaks. Mitigation requires at least two independent verifiers per deployment and an out-of-band override the org defines; a single verifier has no automated fallback.</w:t>
+      </w:r>
+    </w:p>
+    <w:p>
+      <w:pPr>
         <w:pStyle w:val="Heading2"/>
       </w:pPr>
       <w:r>
@@ -1159,7 +1340,7 @@
           <w:i w:val="0"/>
           <w:sz w:val="22"/>
         </w:rPr>
-        <w:t>The device is the source of truth. New posts are saved locally with a “pending” flag, then synced when online. Browsing works fully offline. Current limitations: sync is client→server only (no mesh), conflict resolution is last-write-wins (no CRDT), and there is no end-to-end encryption yet.</w:t>
+        <w:t>The device is the source of truth. New posts are saved locally with a “pending” flag, then synced when online. Browsing works fully offline. Current limitations: sync is client→server only (no mesh), conflict resolution is last-write-wins (no CRDT), and there is no end-to-end encryption yet. Silent data loss is possible if two offline devices edit the same entry; this is a known safety concern for life-saving posts and is not yet mitigated in the UI.</w:t>
       </w:r>
     </w:p>
     <w:p>
@@ -1184,9 +1365,127 @@
           <w:i w:val="0"/>
           <w:sz w:val="22"/>
         </w:rPr>
-        <w:t>The deploying organization defines verifier roles, owns the audit, and handles disputes. The project maintainer governs the software; pilot governance sits with the partner. Verification is transparent (auditable) and reversible so abuse can be detected and corrected — but trust in a verifier is organizational, not technical.</w:t>
+        <w:t>The deploying organization defines verifier roles, owns the audit, and handles disputes. The project maintainer governs the software; pilot governance sits with the partner. Verification is transparent (auditable) and reversible so abuse can be detected and corrected — but trust in a verifier is organizational, not technical, and the trust-bootstrap (who legitimately designates the verifier) is an open, unresolved problem.</w:t>
       </w:r>
     </w:p>
+    <w:p>
+      <w:pPr>
+        <w:spacing w:after="120"/>
+      </w:pPr>
+      <w:r>
+        <w:rPr>
+          <w:b/>
+          <w:i w:val="0"/>
+          <w:sz w:val="20"/>
+        </w:rPr>
+        <w:t>Responsibilities in a pilot:</w:t>
+      </w:r>
+    </w:p>
+    <w:tbl>
+      <w:tblPr>
+        <w:tblStyle w:val="TableGrid"/>
+        <w:tblW w:type="auto" w:w="0"/>
+        <w:tblLook w:firstColumn="1" w:firstRow="1" w:lastColumn="0" w:lastRow="0" w:noHBand="0" w:noVBand="1" w:val="04A0"/>
+      </w:tblPr>
+      <w:tblGrid>
+        <w:gridCol w:w="4320"/>
+        <w:gridCol w:w="4320"/>
+      </w:tblGrid>
+      <w:tr>
+        <w:tc>
+          <w:tcPr>
+            <w:tcW w:type="dxa" w:w="4320"/>
+          </w:tcPr>
+          <w:p>
+            <w:r/>
+            <w:r>
+              <w:rPr>
+                <w:b/>
+                <w:color w:val="0F766E"/>
+                <w:sz w:val="19"/>
+              </w:rPr>
+              <w:t>Partner provides</w:t>
+            </w:r>
+          </w:p>
+        </w:tc>
+        <w:tc>
+          <w:tcPr>
+            <w:tcW w:type="dxa" w:w="4320"/>
+          </w:tcPr>
+          <w:p>
+            <w:r/>
+            <w:r>
+              <w:rPr>
+                <w:b/>
+                <w:color w:val="0F766E"/>
+                <w:sz w:val="19"/>
+              </w:rPr>
+              <w:t>Nidaa team provides</w:t>
+            </w:r>
+          </w:p>
+        </w:tc>
+      </w:tr>
+      <w:tr>
+        <w:tc>
+          <w:tcPr>
+            <w:tcW w:type="dxa" w:w="4320"/>
+          </w:tcPr>
+          <w:p>
+            <w:r/>
+            <w:r>
+              <w:rPr>
+                <w:sz w:val="19"/>
+              </w:rPr>
+              <w:t>≥2 independent verifiers + audit ownership</w:t>
+            </w:r>
+          </w:p>
+        </w:tc>
+        <w:tc>
+          <w:tcPr>
+            <w:tcW w:type="dxa" w:w="4320"/>
+          </w:tcPr>
+          <w:p>
+            <w:r/>
+            <w:r>
+              <w:rPr>
+                <w:sz w:val="19"/>
+              </w:rPr>
+              <w:t>Hosting + sync infrastructure</w:t>
+            </w:r>
+          </w:p>
+        </w:tc>
+      </w:tr>
+      <w:tr>
+        <w:tc>
+          <w:tcPr>
+            <w:tcW w:type="dxa" w:w="4320"/>
+          </w:tcPr>
+          <w:p>
+            <w:r/>
+            <w:r>
+              <w:rPr>
+                <w:sz w:val="19"/>
+              </w:rPr>
+              <w:t>Local governance, dispute handling, staff time</w:t>
+            </w:r>
+          </w:p>
+        </w:tc>
+        <w:tc>
+          <w:tcPr>
+            <w:tcW w:type="dxa" w:w="4320"/>
+          </w:tcPr>
+          <w:p>
+            <w:r/>
+            <w:r>
+              <w:rPr>
+                <w:sz w:val="19"/>
+              </w:rPr>
+              <w:t>Software, metrics, co-authored field report</w:t>
+            </w:r>
+          </w:p>
+        </w:tc>
+      </w:tr>
+    </w:tbl>
     <w:p>
       <w:pPr>
         <w:pStyle w:val="Heading2"/>
@@ -1223,7 +1522,7 @@
         <w:spacing w:after="80"/>
       </w:pPr>
       <w:r>
-        <w:t>Naive conflict resolution; no mesh / offline peer sync.</w:t>
+        <w:t>Naive conflict resolution (last-write-wins, silent loss); no mesh / offline peer sync.</w:t>
       </w:r>
     </w:p>
     <w:p>
@@ -1241,7 +1540,16 @@
         <w:spacing w:after="80"/>
       </w:pPr>
       <w:r>
-        <w:t>Scale, latency, and sync under real networks are unmeasured.</w:t>
+        <w:t>Map facility data is seeded from HDX/OSM without a snapshot date or update path; in active conflict it can be outdated — treat map facilities as indicative until validated.</w:t>
+      </w:r>
+    </w:p>
+    <w:p>
+      <w:pPr>
+        <w:pStyle w:val="ListBullet"/>
+        <w:spacing w:after="80"/>
+      </w:pPr>
+      <w:r>
+        <w:t>In some sandboxed environments the board may render empty if it cannot reach the API; a live deployment avoids this.</w:t>
       </w:r>
     </w:p>
     <w:p>
@@ -1251,6 +1559,15 @@
       </w:pPr>
       <w:r>
         <w:t>Depends on at least one host (mesh is planned, not built).</w:t>
+      </w:r>
+    </w:p>
+    <w:p>
+      <w:pPr>
+        <w:pStyle w:val="ListBullet"/>
+        <w:spacing w:after="80"/>
+      </w:pPr>
+      <w:r>
+        <w:t>Scope: Nidaa is a resilient local list per community; cross-community coordination needs mesh/federation (planned, not built).</w:t>
       </w:r>
     </w:p>
     <w:p>
@@ -1275,7 +1592,7 @@
           <w:i w:val="0"/>
           <w:sz w:val="22"/>
         </w:rPr>
-        <w:t>Intended: a low-risk, instrumented pilot with one reachable coordination community (diaspora mutual-aid orgs are the current outreach target; Gaza NGOs are deferred as currently unreachable). 4–8 weeks, low burden, under one hour of training. The partner defines verifier roles and owns the audit; the Nidaa team provides the host and metrics and co-authors a field report. Success = evidence the board helped coordination; failure = documented lessons. No pilot has launched; outreach is prepared but not yet sent.</w:t>
+        <w:t>Intended: a low-risk, instrumented pilot with one reachable coordination community (diaspora mutual-aid orgs are the current outreach target; Gaza NGOs are deferred as currently unreachable). 4–8 weeks, low burden, under one hour of training. The partner defines verifier roles and owns the audit; the Nidaa team provides the host and metrics and co-authors a field report. Success = evidence the board helped coordination; failure = documented lessons. No pilot has launched; outreach is prepared but not yet sent. Before any pilot, the safety/liability items above (do-no-harm, DPIA, data agreement) must be in place.</w:t>
       </w:r>
     </w:p>
     <w:p>
@@ -1329,7 +1646,7 @@
         <w:rPr>
           <w:sz w:val="21"/>
         </w:rPr>
-        <w:t>No. It is a shared, browsable board for needs and offers — not a feed, profile, or chat network.</w:t>
+        <w:t>No. It is a shared, browsable board for needs and offers — not a feed, profile, or chat network. But we do not dodge the surveillance question: a board of who-needs-what is a sensitive record, and we treat that as a primary risk, not a side note.</w:t>
       </w:r>
     </w:p>
     <w:p>
@@ -1352,7 +1669,7 @@
         <w:rPr>
           <w:sz w:val="21"/>
         </w:rPr>
-        <w:t>Not end-to-end yet. Posts are stored on the device and on the host server. End-to-end encryption is planned but not built. Self-hosting is emphasized so the deploying org controls the data.</w:t>
+        <w:t>Not end-to-end yet. Posts are stored on the device and on the host server in a readable form. E2E is planned but not built. Self-hosting is intended but not yet packaged. Do not treat Nidaa as private until those ship.</w:t>
       </w:r>
     </w:p>
     <w:p>
@@ -1421,7 +1738,7 @@
         <w:rPr>
           <w:sz w:val="21"/>
         </w:rPr>
-        <w:t>Every verification action is audited (actor, prior/new state, timestamp) and reversible, so another verifier can undo it. The mitigation is attribution + reversibility; trust in the verifier is the organization's responsibility, not a software guarantee.</w:t>
+        <w:t>Every verification action is audited (actor, prior/new state, timestamp) and reversible, so another verifier can undo it — provided at least two independent verifiers exist. With a single verifier there is no automated fallback; the org must define an out-of-band override. Trust in the verifier is the organization's responsibility, not a software guarantee.</w:t>
       </w:r>
     </w:p>
     <w:p>
@@ -1467,7 +1784,7 @@
         <w:rPr>
           <w:sz w:val="21"/>
         </w:rPr>
-        <w:t>WhatsApp is private messaging; posts there are not browsable, persist per-account, and anyone can claim anything. Nidaa is a shared board that survives disconnection and is verifiable. It can complement WhatsApp (e.g. receive posts from a group), not replace it.</w:t>
+        <w:t>WhatsApp is private messaging; posts there are not browsable, persist per-account, and anyone can claim anything. Nidaa is a shared board that survives disconnection and is verifiable. It can complement WhatsApp (e.g. receive posts from a group), not replace it. We acknowledge WhatsApp is more mature and has network effects we do not.</w:t>
       </w:r>
     </w:p>
     <w:p>
@@ -1513,7 +1830,7 @@
         <w:rPr>
           <w:sz w:val="21"/>
         </w:rPr>
-        <w:t>Intended: the deploying organization, via self-hosting and export. This is a design commitment; the exact contractual terms for a pilot are to be defined with the partner.</w:t>
+        <w:t>Intended: the deploying organization, via self-hosting and export. Export UI and self-host packaging are not yet built; today data would sit on the Nidaa team's host. A pilot data-processing agreement stating ownership and deletion is still to be completed.</w:t>
       </w:r>
     </w:p>
     <w:p>
@@ -1536,7 +1853,7 @@
         <w:rPr>
           <w:sz w:val="21"/>
         </w:rPr>
-        <w:t>Active development, prototype stage, pilot-preparation. Core coordination, offline-first storage, and role-gated verification with audit exist. Identity, mesh, CRDT, AI assistance, and any real pilot do not.</w:t>
+        <w:t>Active development, prototype stage, pilot-preparation. Core coordination, offline-first storage, and role-gated verification with audit exist. Identity, mesh, CRDT, E2E, AI assistance, and any real pilot do not.</w:t>
       </w:r>
     </w:p>
     <w:p>
@@ -1582,7 +1899,7 @@
         <w:rPr>
           <w:sz w:val="21"/>
         </w:rPr>
-        <w:t>A designated verifier role owner, low burden, 4–8 weeks, and under one hour of training. The partner owns verifier governance and the audit; the Nidaa team provides the host and metrics.</w:t>
+        <w:t>At least two independent verifiers, 30–100 participants, low burden, 4–8 weeks, under one hour of training, and ownership of local governance/audit. The Nidaa team provides hosting, software, and metrics.</w:t>
       </w:r>
     </w:p>
     <w:p>
@@ -1605,7 +1922,7 @@
         <w:rPr>
           <w:sz w:val="21"/>
         </w:rPr>
-        <w:t>No. The sample entries shipped with the app are illustrative (Syria cities) and explicitly not real operational data. The production dataset is intended to come from humanitarian sources and live posts.</w:t>
+        <w:t>No. The sample entries are illustrative (Syria cities) and explicitly not real operational data. The map facilities are seeded from HDX/OSM but carry no snapshot date — treat them as indicative, not current.</w:t>
       </w:r>
     </w:p>
     <w:p>
@@ -1640,6 +1957,29 @@
           <w:b/>
           <w:color w:val="111827"/>
         </w:rPr>
+        <w:t>Q: What about the targeting / surveillance risk?</w:t>
+      </w:r>
+    </w:p>
+    <w:p>
+      <w:pPr>
+        <w:spacing w:after="160"/>
+      </w:pPr>
+      <w:r>
+        <w:rPr>
+          <w:sz w:val="21"/>
+        </w:rPr>
+        <w:t>It is real. A geolocated board of needs can be weaponized. Mitigations today are limited: optional precise coordinates (flagged as potentially unsafe), no mandatory personal data, and self-hosting (planned). We recommend deployments minimize precise coordinates and weigh this risk explicitly before launch. This is the primary ethical risk, not a footnote.</w:t>
+      </w:r>
+    </w:p>
+    <w:p>
+      <w:pPr>
+        <w:spacing w:after="20"/>
+      </w:pPr>
+      <w:r>
+        <w:rPr>
+          <w:b/>
+          <w:color w:val="111827"/>
+        </w:rPr>
         <w:t>Q: What is the single biggest risk to Nidaa?</w:t>
       </w:r>
     </w:p>
@@ -1651,7 +1991,7 @@
         <w:rPr>
           <w:sz w:val="21"/>
         </w:rPr>
-        <w:t>No real-world validation — building technically interesting infrastructure that communities do not actually adopt. The pilot is the instrument for answering that.</w:t>
+        <w:t>Two kinds, ranked by harm to affected people: (1) physical/safety harm if the board is misused for targeting or misinformation; (2) no real-world validation — building infrastructure communities do not adopt. The pilot is the instrument for answering the second; the safety items above must be addressed before the first.</w:t>
       </w:r>
     </w:p>
     <w:p>

</xml_diff>